<commit_message>
Deploying to gh-pages from @ POLISH-QUALITY-BOARD/PQB@f0bb62dac9d8b327570d4750b5acc7066a75b13b 🚀
</commit_message>
<xml_diff>
--- a/preview/pr-53/documents/Szablon-wniosek-o-akredytacje-dostawcy-szkoleń-v1.0.docx
+++ b/preview/pr-53/documents/Szablon-wniosek-o-akredytacje-dostawcy-szkoleń-v1.0.docx
@@ -4,8 +4,13 @@
   <w:body>
     <w:p>
       <w:pPr>
-        <w:jc w:val="right"/>
-      </w:pPr>
+        <w:tabs>
+          <w:tab w:val="left" w:pos="4050"/>
+        </w:tabs>
+      </w:pPr>
+      <w:r>
+        <w:tab/>
+      </w:r>
     </w:p>
     <w:p>
       <w:pPr>
@@ -75,10 +80,16 @@
       </w:r>
       <w:r>
         <w:tab/>
-        <w:t>Nowy wniosek akredytacyjny</w:t>
+        <w:t>Now</w:t>
+      </w:r>
+      <w:r>
+        <w:t>a akredytacja</w:t>
       </w:r>
     </w:p>
     <w:p>
+      <w:pPr>
+        <w:spacing w:after="0"/>
+      </w:pPr>
       <w:r>
         <w:rPr>
           <w:rFonts w:ascii="MS Gothic" w:eastAsia="MS Gothic" w:hAnsi="MS Gothic" w:cs="MS Gothic"/>
@@ -89,6 +100,37 @@
       </w:r>
       <w:r>
         <w:tab/>
+        <w:t>Przedłużenie akredytacji</w:t>
+      </w:r>
+    </w:p>
+    <w:p>
+      <w:pPr>
+        <w:spacing w:after="0"/>
+      </w:pPr>
+      <w:r>
+        <w:rPr>
+          <w:rFonts w:ascii="MS Gothic" w:eastAsia="MS Gothic" w:hAnsi="MS Gothic" w:cs="MS Gothic"/>
+          <w:sz w:val="32"/>
+          <w:szCs w:val="32"/>
+        </w:rPr>
+        <w:t>☐</w:t>
+      </w:r>
+      <w:r>
+        <w:tab/>
+        <w:t>Cross-akredytacja</w:t>
+      </w:r>
+    </w:p>
+    <w:p>
+      <w:r>
+        <w:rPr>
+          <w:rFonts w:ascii="MS Gothic" w:eastAsia="MS Gothic" w:hAnsi="MS Gothic" w:cs="MS Gothic"/>
+          <w:sz w:val="32"/>
+          <w:szCs w:val="32"/>
+        </w:rPr>
+        <w:t>☐</w:t>
+      </w:r>
+      <w:r>
+        <w:tab/>
         <w:t xml:space="preserve">Przeniesienie akredytacji </w:t>
       </w:r>
       <w:r>
@@ -101,7 +143,13 @@
         <w:t>organizacji</w:t>
       </w:r>
       <w:r>
-        <w:t xml:space="preserve"> (na terenie Polski)</w:t>
+        <w:t xml:space="preserve"> (</w:t>
+      </w:r>
+      <w:r>
+        <w:t>krajowej</w:t>
+      </w:r>
+      <w:r>
+        <w:t>)</w:t>
       </w:r>
     </w:p>
     <w:p/>
@@ -973,7 +1021,6 @@
                 <w:sz w:val="20"/>
                 <w:szCs w:val="20"/>
               </w:rPr>
-              <w:lastRenderedPageBreak/>
               <w:t>WYMAGANE ZAŁĄCZNIKI DO WNIOSKU</w:t>
             </w:r>
           </w:p>
@@ -1880,7 +1927,6 @@
           <w:between w:val="nil"/>
         </w:pBdr>
         <w:spacing w:after="280" w:line="240" w:lineRule="auto"/>
-        <w:ind w:left="720"/>
         <w:rPr>
           <w:color w:val="000000"/>
           <w:sz w:val="24"/>
@@ -1908,36 +1954,70 @@
     </w:p>
     <w:p>
       <w:pPr>
-        <w:pBdr>
-          <w:top w:val="nil"/>
-          <w:left w:val="nil"/>
-          <w:bottom w:val="nil"/>
-          <w:right w:val="nil"/>
-          <w:between w:val="nil"/>
-        </w:pBdr>
-        <w:spacing w:after="280" w:line="240" w:lineRule="auto"/>
-        <w:ind w:left="720"/>
-        <w:rPr>
-          <w:color w:val="000000"/>
-          <w:sz w:val="24"/>
-          <w:szCs w:val="24"/>
-        </w:rPr>
-      </w:pPr>
+        <w:jc w:val="right"/>
+        <w:rPr>
+          <w:sz w:val="20"/>
+          <w:szCs w:val="20"/>
+        </w:rPr>
+      </w:pPr>
+      <w:r>
+        <w:rPr>
+          <w:sz w:val="20"/>
+          <w:szCs w:val="20"/>
+        </w:rPr>
+        <w:t>………………………………………………………………………………….</w:t>
+      </w:r>
     </w:p>
     <w:p>
       <w:pPr>
-        <w:jc w:val="right"/>
-        <w:rPr>
-          <w:sz w:val="20"/>
-          <w:szCs w:val="20"/>
-        </w:rPr>
-      </w:pPr>
-      <w:r>
-        <w:rPr>
-          <w:sz w:val="20"/>
-          <w:szCs w:val="20"/>
-        </w:rPr>
-        <w:t>………………………………………………………………………………….</w:t>
+        <w:ind w:left="2880" w:firstLine="720"/>
+        <w:jc w:val="center"/>
+        <w:rPr>
+          <w:sz w:val="20"/>
+          <w:szCs w:val="20"/>
+        </w:rPr>
+      </w:pPr>
+      <w:r>
+        <w:rPr>
+          <w:sz w:val="20"/>
+          <w:szCs w:val="20"/>
+        </w:rPr>
+        <w:t>I</w:t>
+      </w:r>
+      <w:r>
+        <w:rPr>
+          <w:sz w:val="20"/>
+          <w:szCs w:val="20"/>
+        </w:rPr>
+        <w:t xml:space="preserve">mię i nazwisko / </w:t>
+      </w:r>
+      <w:r>
+        <w:rPr>
+          <w:sz w:val="20"/>
+          <w:szCs w:val="20"/>
+        </w:rPr>
+        <w:t>d</w:t>
+      </w:r>
+      <w:r>
+        <w:rPr>
+          <w:sz w:val="20"/>
+          <w:szCs w:val="20"/>
+        </w:rPr>
+        <w:t xml:space="preserve">ata / </w:t>
+      </w:r>
+      <w:r>
+        <w:rPr>
+          <w:sz w:val="20"/>
+          <w:szCs w:val="20"/>
+        </w:rPr>
+        <w:t>p</w:t>
+      </w:r>
+      <w:r>
+        <w:rPr>
+          <w:sz w:val="20"/>
+          <w:szCs w:val="20"/>
+        </w:rPr>
+        <w:t>odpi</w:t>
       </w:r>
     </w:p>
     <w:p>
@@ -1945,71 +2025,12 @@
         <w:ind w:left="2880" w:firstLine="720"/>
         <w:jc w:val="center"/>
         <w:rPr>
-          <w:sz w:val="20"/>
-          <w:szCs w:val="20"/>
-        </w:rPr>
-      </w:pPr>
-      <w:r>
-        <w:rPr>
-          <w:sz w:val="20"/>
-          <w:szCs w:val="20"/>
-        </w:rPr>
-        <w:t>I</w:t>
-      </w:r>
-      <w:r>
-        <w:rPr>
-          <w:sz w:val="20"/>
-          <w:szCs w:val="20"/>
-        </w:rPr>
-        <w:t xml:space="preserve">mię i nazwisko / </w:t>
-      </w:r>
-      <w:r>
-        <w:rPr>
-          <w:sz w:val="20"/>
-          <w:szCs w:val="20"/>
-        </w:rPr>
-        <w:t>d</w:t>
-      </w:r>
-      <w:r>
-        <w:rPr>
-          <w:sz w:val="20"/>
-          <w:szCs w:val="20"/>
-        </w:rPr>
-        <w:t xml:space="preserve">ata / </w:t>
-      </w:r>
-      <w:r>
-        <w:rPr>
-          <w:sz w:val="20"/>
-          <w:szCs w:val="20"/>
-        </w:rPr>
-        <w:t>p</w:t>
-      </w:r>
-      <w:r>
-        <w:rPr>
-          <w:sz w:val="20"/>
-          <w:szCs w:val="20"/>
-        </w:rPr>
-        <w:t>odpis</w:t>
-      </w:r>
-    </w:p>
-    <w:p>
-      <w:pPr>
-        <w:rPr>
           <w:b/>
           <w:bCs/>
           <w:sz w:val="20"/>
           <w:szCs w:val="20"/>
         </w:rPr>
       </w:pPr>
-      <w:r>
-        <w:rPr>
-          <w:b/>
-          <w:bCs/>
-          <w:sz w:val="20"/>
-          <w:szCs w:val="20"/>
-        </w:rPr>
-        <w:br w:type="page"/>
-      </w:r>
     </w:p>
     <w:p>
       <w:pPr>
@@ -2168,39 +2189,7 @@
           <w:sz w:val="20"/>
           <w:szCs w:val="20"/>
         </w:rPr>
-        <w:t xml:space="preserve">towarzyszenie Polish Quality Board (zwane dalej PQB), z siedzibą w </w:t>
-      </w:r>
-      <w:proofErr w:type="spellStart"/>
-      <w:r>
-        <w:rPr>
-          <w:sz w:val="20"/>
-          <w:szCs w:val="20"/>
-        </w:rPr>
-        <w:t>Niemczu</w:t>
-      </w:r>
-      <w:proofErr w:type="spellEnd"/>
-      <w:r>
-        <w:rPr>
-          <w:sz w:val="20"/>
-          <w:szCs w:val="20"/>
-        </w:rPr>
-        <w:t xml:space="preserve">, ul. H. </w:t>
-      </w:r>
-      <w:proofErr w:type="spellStart"/>
-      <w:r>
-        <w:rPr>
-          <w:sz w:val="20"/>
-          <w:szCs w:val="20"/>
-        </w:rPr>
-        <w:t>Mrossa</w:t>
-      </w:r>
-      <w:proofErr w:type="spellEnd"/>
-      <w:r>
-        <w:rPr>
-          <w:sz w:val="20"/>
-          <w:szCs w:val="20"/>
-        </w:rPr>
-        <w:t xml:space="preserve"> 4C/14, kod pocztowy 86-032.</w:t>
+        <w:t>towarzyszenie Polish Quality Board (zwane dalej PQB), z siedzibą w Niemczu, ul. H. Mrossa 4C/14, kod pocztowy 86-032.</w:t>
       </w:r>
     </w:p>
     <w:p>
@@ -2544,10 +2533,12 @@
       </w:r>
     </w:p>
     <w:sectPr>
-      <w:headerReference w:type="default" r:id="rId9"/>
-      <w:footerReference w:type="default" r:id="rId10"/>
-      <w:headerReference w:type="first" r:id="rId11"/>
-      <w:footerReference w:type="first" r:id="rId12"/>
+      <w:headerReference w:type="even" r:id="rId9"/>
+      <w:headerReference w:type="default" r:id="rId10"/>
+      <w:footerReference w:type="even" r:id="rId11"/>
+      <w:footerReference w:type="default" r:id="rId12"/>
+      <w:headerReference w:type="first" r:id="rId13"/>
+      <w:footerReference w:type="first" r:id="rId14"/>
       <w:pgSz w:w="11906" w:h="16838"/>
       <w:pgMar w:top="1996" w:right="1417" w:bottom="1417" w:left="1417" w:header="568" w:footer="567" w:gutter="0"/>
       <w:pgNumType w:start="1"/>
@@ -2588,198 +2579,8 @@
 <w:ftr xmlns:wpc="http://schemas.microsoft.com/office/word/2010/wordprocessingCanvas" xmlns:cx="http://schemas.microsoft.com/office/drawing/2014/chartex" xmlns:cx1="http://schemas.microsoft.com/office/drawing/2015/9/8/chartex" xmlns:cx2="http://schemas.microsoft.com/office/drawing/2015/10/21/chartex" xmlns:cx3="http://schemas.microsoft.com/office/drawing/2016/5/9/chartex" xmlns:cx4="http://schemas.microsoft.com/office/drawing/2016/5/10/chartex" xmlns:cx5="http://schemas.microsoft.com/office/drawing/2016/5/11/chartex" xmlns:cx6="http://schemas.microsoft.com/office/drawing/2016/5/12/chartex" xmlns:cx7="http://schemas.microsoft.com/office/drawing/2016/5/13/chartex" xmlns:cx8="http://schemas.microsoft.com/office/drawing/2016/5/14/chartex" xmlns:mc="http://schemas.openxmlformats.org/markup-compatibility/2006" xmlns:aink="http://schemas.microsoft.com/office/drawing/2016/ink" xmlns:am3d="http://schemas.microsoft.com/office/drawing/2017/model3d" xmlns:o="urn:schemas-microsoft-com:office:office" xmlns:oel="http://schemas.microsoft.com/office/2019/extlst" xmlns:r="http://schemas.openxmlformats.org/officeDocument/2006/relationships" xmlns:m="http://schemas.openxmlformats.org/officeDocument/2006/math" xmlns:v="urn:schemas-microsoft-com:vml" xmlns:wp14="http://schemas.microsoft.com/office/word/2010/wordprocessingDrawing" xmlns:wp="http://schemas.openxmlformats.org/drawingml/2006/wordprocessingDrawing" xmlns:w10="urn:schemas-microsoft-com:office:word" xmlns:w="http://schemas.openxmlformats.org/wordprocessingml/2006/main" xmlns:w14="http://schemas.microsoft.com/office/word/2010/wordml" xmlns:w15="http://schemas.microsoft.com/office/word/2012/wordml" xmlns:w16cex="http://schemas.microsoft.com/office/word/2018/wordml/cex" xmlns:w16cid="http://schemas.microsoft.com/office/word/2016/wordml/cid" xmlns:w16="http://schemas.microsoft.com/office/word/2018/wordml" xmlns:w16du="http://schemas.microsoft.com/office/word/2023/wordml/word16du" xmlns:w16sdtdh="http://schemas.microsoft.com/office/word/2020/wordml/sdtdatahash" xmlns:w16sdtfl="http://schemas.microsoft.com/office/word/2024/wordml/sdtformatlock" xmlns:w16se="http://schemas.microsoft.com/office/word/2015/wordml/symex" xmlns:wpg="http://schemas.microsoft.com/office/word/2010/wordprocessingGroup" xmlns:wpi="http://schemas.microsoft.com/office/word/2010/wordprocessingInk" xmlns:wne="http://schemas.microsoft.com/office/word/2006/wordml" xmlns:wps="http://schemas.microsoft.com/office/word/2010/wordprocessingShape" mc:Ignorable="w14 w15 w16se w16cid w16 w16cex w16sdtdh w16sdtfl w16du wp14">
   <w:p>
     <w:pPr>
-      <w:pBdr>
-        <w:top w:val="single" w:sz="8" w:space="1" w:color="000000"/>
-        <w:left w:val="nil"/>
-        <w:bottom w:val="nil"/>
-        <w:right w:val="nil"/>
-        <w:between w:val="nil"/>
-      </w:pBdr>
-      <w:tabs>
-        <w:tab w:val="center" w:pos="4536"/>
-        <w:tab w:val="right" w:pos="9072"/>
-      </w:tabs>
-      <w:spacing w:before="120" w:after="0" w:line="240" w:lineRule="auto"/>
-      <w:rPr>
-        <w:rFonts w:asciiTheme="minorHAnsi" w:hAnsiTheme="minorHAnsi"/>
-        <w:color w:val="000000"/>
-        <w:sz w:val="20"/>
-        <w:szCs w:val="20"/>
-      </w:rPr>
+      <w:pStyle w:val="Stopka"/>
     </w:pPr>
-    <w:r>
-      <w:rPr>
-        <w:rFonts w:asciiTheme="minorHAnsi" w:hAnsiTheme="minorHAnsi"/>
-        <w:color w:val="000000"/>
-        <w:sz w:val="20"/>
-        <w:szCs w:val="20"/>
-      </w:rPr>
-      <w:t>wersja 1.0</w:t>
-    </w:r>
-    <w:r>
-      <w:rPr>
-        <w:rFonts w:asciiTheme="minorHAnsi" w:hAnsiTheme="minorHAnsi"/>
-        <w:color w:val="000000"/>
-        <w:sz w:val="20"/>
-        <w:szCs w:val="20"/>
-      </w:rPr>
-      <w:tab/>
-    </w:r>
-    <w:r>
-      <w:rPr>
-        <w:rFonts w:asciiTheme="minorHAnsi" w:hAnsiTheme="minorHAnsi"/>
-        <w:color w:val="000000"/>
-        <w:sz w:val="20"/>
-        <w:szCs w:val="20"/>
-      </w:rPr>
-      <w:t xml:space="preserve">str. </w:t>
-    </w:r>
-    <w:r>
-      <w:rPr>
-        <w:rFonts w:asciiTheme="minorHAnsi" w:hAnsiTheme="minorHAnsi"/>
-        <w:color w:val="000000"/>
-        <w:sz w:val="20"/>
-        <w:szCs w:val="20"/>
-      </w:rPr>
-      <w:fldChar w:fldCharType="begin"/>
-    </w:r>
-    <w:r>
-      <w:rPr>
-        <w:rFonts w:asciiTheme="minorHAnsi" w:hAnsiTheme="minorHAnsi"/>
-        <w:color w:val="000000"/>
-        <w:sz w:val="20"/>
-        <w:szCs w:val="20"/>
-      </w:rPr>
-      <w:instrText>PAGE</w:instrText>
-    </w:r>
-    <w:r>
-      <w:rPr>
-        <w:rFonts w:asciiTheme="minorHAnsi" w:hAnsiTheme="minorHAnsi"/>
-        <w:color w:val="000000"/>
-        <w:sz w:val="20"/>
-        <w:szCs w:val="20"/>
-      </w:rPr>
-      <w:fldChar w:fldCharType="separate"/>
-    </w:r>
-    <w:r>
-      <w:rPr>
-        <w:rFonts w:asciiTheme="minorHAnsi" w:hAnsiTheme="minorHAnsi"/>
-        <w:noProof/>
-        <w:color w:val="000000"/>
-        <w:sz w:val="20"/>
-        <w:szCs w:val="20"/>
-      </w:rPr>
-      <w:t>2</w:t>
-    </w:r>
-    <w:r>
-      <w:rPr>
-        <w:rFonts w:asciiTheme="minorHAnsi" w:hAnsiTheme="minorHAnsi"/>
-        <w:color w:val="000000"/>
-        <w:sz w:val="20"/>
-        <w:szCs w:val="20"/>
-      </w:rPr>
-      <w:fldChar w:fldCharType="end"/>
-    </w:r>
-    <w:r>
-      <w:rPr>
-        <w:rFonts w:asciiTheme="minorHAnsi" w:hAnsiTheme="minorHAnsi"/>
-        <w:color w:val="000000"/>
-        <w:sz w:val="20"/>
-        <w:szCs w:val="20"/>
-      </w:rPr>
-      <w:t xml:space="preserve"> </w:t>
-    </w:r>
-    <w:r>
-      <w:rPr>
-        <w:rFonts w:asciiTheme="minorHAnsi" w:hAnsiTheme="minorHAnsi"/>
-        <w:color w:val="000000"/>
-        <w:sz w:val="20"/>
-        <w:szCs w:val="20"/>
-      </w:rPr>
-      <w:tab/>
-    </w:r>
-    <w:r>
-      <w:rPr>
-        <w:rFonts w:asciiTheme="minorHAnsi" w:hAnsiTheme="minorHAnsi"/>
-        <w:color w:val="000000"/>
-        <w:sz w:val="20"/>
-        <w:szCs w:val="20"/>
-        <w:lang w:val="en-GB"/>
-      </w:rPr>
-      <w:fldChar w:fldCharType="begin"/>
-    </w:r>
-    <w:r>
-      <w:rPr>
-        <w:rFonts w:asciiTheme="minorHAnsi" w:hAnsiTheme="minorHAnsi"/>
-        <w:color w:val="000000"/>
-        <w:sz w:val="20"/>
-        <w:szCs w:val="20"/>
-        <w:lang w:val="en-GB"/>
-      </w:rPr>
-      <w:instrText xml:space="preserve"> CREATEDATE \@ "yyyy-MM-dd" \* MERGEFORMAT </w:instrText>
-    </w:r>
-    <w:r>
-      <w:rPr>
-        <w:rFonts w:asciiTheme="minorHAnsi" w:hAnsiTheme="minorHAnsi"/>
-        <w:color w:val="000000"/>
-        <w:sz w:val="20"/>
-        <w:szCs w:val="20"/>
-        <w:lang w:val="en-GB"/>
-      </w:rPr>
-      <w:fldChar w:fldCharType="separate"/>
-    </w:r>
-    <w:r>
-      <w:rPr>
-        <w:rFonts w:asciiTheme="minorHAnsi" w:hAnsiTheme="minorHAnsi"/>
-        <w:noProof/>
-        <w:color w:val="000000"/>
-        <w:sz w:val="20"/>
-        <w:szCs w:val="20"/>
-        <w:lang w:val="en-GB"/>
-      </w:rPr>
-      <w:t>2026-03-22</w:t>
-    </w:r>
-    <w:r>
-      <w:rPr>
-        <w:rFonts w:asciiTheme="minorHAnsi" w:hAnsiTheme="minorHAnsi"/>
-        <w:color w:val="000000"/>
-        <w:sz w:val="20"/>
-        <w:szCs w:val="20"/>
-        <w:lang w:val="en-GB"/>
-      </w:rPr>
-      <w:fldChar w:fldCharType="end"/>
-    </w:r>
-  </w:p>
-  <w:p>
-    <w:pPr>
-      <w:pBdr>
-        <w:top w:val="single" w:sz="8" w:space="1" w:color="000000"/>
-        <w:left w:val="nil"/>
-        <w:bottom w:val="nil"/>
-        <w:right w:val="nil"/>
-        <w:between w:val="nil"/>
-      </w:pBdr>
-      <w:tabs>
-        <w:tab w:val="center" w:pos="4536"/>
-        <w:tab w:val="right" w:pos="9072"/>
-      </w:tabs>
-      <w:spacing w:after="0" w:line="240" w:lineRule="auto"/>
-      <w:rPr>
-        <w:rFonts w:asciiTheme="minorHAnsi" w:hAnsiTheme="minorHAnsi"/>
-        <w:color w:val="000000"/>
-        <w:sz w:val="20"/>
-        <w:szCs w:val="20"/>
-      </w:rPr>
-    </w:pPr>
-    <w:r>
-      <w:rPr>
-        <w:rFonts w:asciiTheme="minorHAnsi" w:hAnsiTheme="minorHAnsi"/>
-        <w:color w:val="000000"/>
-        <w:sz w:val="20"/>
-        <w:szCs w:val="20"/>
-      </w:rPr>
-      <w:t>© Polish Quality Board</w:t>
-    </w:r>
   </w:p>
 </w:ftr>
 </file>
@@ -2824,6 +2625,14 @@
         <w:szCs w:val="20"/>
       </w:rPr>
       <w:tab/>
+    </w:r>
+    <w:r>
+      <w:rPr>
+        <w:rFonts w:asciiTheme="minorHAnsi" w:hAnsiTheme="minorHAnsi"/>
+        <w:color w:val="000000"/>
+        <w:sz w:val="20"/>
+        <w:szCs w:val="20"/>
+      </w:rPr>
       <w:t xml:space="preserve">str. </w:t>
     </w:r>
     <w:r>
@@ -2855,6 +2664,8 @@
     </w:r>
     <w:r>
       <w:rPr>
+        <w:rFonts w:asciiTheme="minorHAnsi" w:hAnsiTheme="minorHAnsi"/>
+        <w:noProof/>
         <w:color w:val="000000"/>
         <w:sz w:val="20"/>
         <w:szCs w:val="20"/>
@@ -2886,6 +2697,55 @@
         <w:sz w:val="20"/>
         <w:szCs w:val="20"/>
       </w:rPr>
+      <w:t xml:space="preserve">/ </w:t>
+    </w:r>
+    <w:r>
+      <w:rPr>
+        <w:color w:val="000000"/>
+        <w:sz w:val="20"/>
+        <w:szCs w:val="20"/>
+      </w:rPr>
+      <w:fldChar w:fldCharType="begin"/>
+    </w:r>
+    <w:r>
+      <w:rPr>
+        <w:color w:val="000000"/>
+        <w:sz w:val="20"/>
+        <w:szCs w:val="20"/>
+      </w:rPr>
+      <w:instrText xml:space="preserve"> NUMPAGES  \# "0" \* Arabic  \* MERGEFORMAT </w:instrText>
+    </w:r>
+    <w:r>
+      <w:rPr>
+        <w:color w:val="000000"/>
+        <w:sz w:val="20"/>
+        <w:szCs w:val="20"/>
+      </w:rPr>
+      <w:fldChar w:fldCharType="separate"/>
+    </w:r>
+    <w:r>
+      <w:rPr>
+        <w:color w:val="000000"/>
+        <w:sz w:val="20"/>
+        <w:szCs w:val="20"/>
+      </w:rPr>
+      <w:t>4</w:t>
+    </w:r>
+    <w:r>
+      <w:rPr>
+        <w:color w:val="000000"/>
+        <w:sz w:val="20"/>
+        <w:szCs w:val="20"/>
+      </w:rPr>
+      <w:fldChar w:fldCharType="end"/>
+    </w:r>
+    <w:r>
+      <w:rPr>
+        <w:rFonts w:asciiTheme="minorHAnsi" w:hAnsiTheme="minorHAnsi"/>
+        <w:color w:val="000000"/>
+        <w:sz w:val="20"/>
+        <w:szCs w:val="20"/>
+      </w:rPr>
       <w:tab/>
     </w:r>
     <w:r>
@@ -2927,7 +2787,18 @@
         <w:szCs w:val="20"/>
         <w:lang w:val="en-GB"/>
       </w:rPr>
-      <w:t>2026-03-19</w:t>
+      <w:t>2026-03-</w:t>
+    </w:r>
+    <w:r>
+      <w:rPr>
+        <w:rFonts w:asciiTheme="minorHAnsi" w:hAnsiTheme="minorHAnsi"/>
+        <w:noProof/>
+        <w:color w:val="000000"/>
+        <w:sz w:val="20"/>
+        <w:szCs w:val="20"/>
+        <w:lang w:val="en-GB"/>
+      </w:rPr>
+      <w:t>31</w:t>
     </w:r>
     <w:r>
       <w:rPr>
@@ -2967,6 +2838,268 @@
         <w:color w:val="000000"/>
         <w:sz w:val="20"/>
         <w:szCs w:val="20"/>
+      </w:rPr>
+      <w:t>© Polish Quality Board</w:t>
+    </w:r>
+  </w:p>
+</w:ftr>
+</file>
+
+<file path=word/footer3.xml><?xml version="1.0" encoding="utf-8"?>
+<w:ftr xmlns:wpc="http://schemas.microsoft.com/office/word/2010/wordprocessingCanvas" xmlns:cx="http://schemas.microsoft.com/office/drawing/2014/chartex" xmlns:cx1="http://schemas.microsoft.com/office/drawing/2015/9/8/chartex" xmlns:cx2="http://schemas.microsoft.com/office/drawing/2015/10/21/chartex" xmlns:cx3="http://schemas.microsoft.com/office/drawing/2016/5/9/chartex" xmlns:cx4="http://schemas.microsoft.com/office/drawing/2016/5/10/chartex" xmlns:cx5="http://schemas.microsoft.com/office/drawing/2016/5/11/chartex" xmlns:cx6="http://schemas.microsoft.com/office/drawing/2016/5/12/chartex" xmlns:cx7="http://schemas.microsoft.com/office/drawing/2016/5/13/chartex" xmlns:cx8="http://schemas.microsoft.com/office/drawing/2016/5/14/chartex" xmlns:mc="http://schemas.openxmlformats.org/markup-compatibility/2006" xmlns:aink="http://schemas.microsoft.com/office/drawing/2016/ink" xmlns:am3d="http://schemas.microsoft.com/office/drawing/2017/model3d" xmlns:o="urn:schemas-microsoft-com:office:office" xmlns:oel="http://schemas.microsoft.com/office/2019/extlst" xmlns:r="http://schemas.openxmlformats.org/officeDocument/2006/relationships" xmlns:m="http://schemas.openxmlformats.org/officeDocument/2006/math" xmlns:v="urn:schemas-microsoft-com:vml" xmlns:wp14="http://schemas.microsoft.com/office/word/2010/wordprocessingDrawing" xmlns:wp="http://schemas.openxmlformats.org/drawingml/2006/wordprocessingDrawing" xmlns:w10="urn:schemas-microsoft-com:office:word" xmlns:w="http://schemas.openxmlformats.org/wordprocessingml/2006/main" xmlns:w14="http://schemas.microsoft.com/office/word/2010/wordml" xmlns:w15="http://schemas.microsoft.com/office/word/2012/wordml" xmlns:w16cex="http://schemas.microsoft.com/office/word/2018/wordml/cex" xmlns:w16cid="http://schemas.microsoft.com/office/word/2016/wordml/cid" xmlns:w16="http://schemas.microsoft.com/office/word/2018/wordml" xmlns:w16du="http://schemas.microsoft.com/office/word/2023/wordml/word16du" xmlns:w16sdtdh="http://schemas.microsoft.com/office/word/2020/wordml/sdtdatahash" xmlns:w16sdtfl="http://schemas.microsoft.com/office/word/2024/wordml/sdtformatlock" xmlns:w16se="http://schemas.microsoft.com/office/word/2015/wordml/symex" xmlns:wpg="http://schemas.microsoft.com/office/word/2010/wordprocessingGroup" xmlns:wpi="http://schemas.microsoft.com/office/word/2010/wordprocessingInk" xmlns:wne="http://schemas.microsoft.com/office/word/2006/wordml" xmlns:wps="http://schemas.microsoft.com/office/word/2010/wordprocessingShape" mc:Ignorable="w14 w15 w16se w16cid w16 w16cex w16sdtdh w16sdtfl w16du wp14">
+  <w:p>
+    <w:pPr>
+      <w:pBdr>
+        <w:top w:val="single" w:sz="8" w:space="1" w:color="000000"/>
+        <w:left w:val="nil"/>
+        <w:bottom w:val="nil"/>
+        <w:right w:val="nil"/>
+        <w:between w:val="nil"/>
+      </w:pBdr>
+      <w:tabs>
+        <w:tab w:val="center" w:pos="4536"/>
+        <w:tab w:val="right" w:pos="9072"/>
+      </w:tabs>
+      <w:spacing w:before="120" w:after="0" w:line="240" w:lineRule="auto"/>
+      <w:rPr>
+        <w:rFonts w:asciiTheme="minorHAnsi" w:hAnsiTheme="minorHAnsi"/>
+        <w:color w:val="000000"/>
+        <w:sz w:val="20"/>
+        <w:szCs w:val="20"/>
+        <w:lang w:val="en-GB"/>
+      </w:rPr>
+    </w:pPr>
+    <w:r>
+      <w:rPr>
+        <w:rFonts w:asciiTheme="minorHAnsi" w:hAnsiTheme="minorHAnsi"/>
+        <w:color w:val="000000"/>
+        <w:sz w:val="20"/>
+        <w:szCs w:val="20"/>
+        <w:lang w:val="en-GB"/>
+      </w:rPr>
+      <w:t>wersja 1.0</w:t>
+    </w:r>
+    <w:r>
+      <w:rPr>
+        <w:rFonts w:asciiTheme="minorHAnsi" w:hAnsiTheme="minorHAnsi"/>
+        <w:color w:val="000000"/>
+        <w:sz w:val="20"/>
+        <w:szCs w:val="20"/>
+        <w:lang w:val="en-GB"/>
+      </w:rPr>
+      <w:tab/>
+      <w:t xml:space="preserve">str. </w:t>
+    </w:r>
+    <w:r>
+      <w:rPr>
+        <w:rFonts w:asciiTheme="minorHAnsi" w:hAnsiTheme="minorHAnsi"/>
+        <w:color w:val="000000"/>
+        <w:sz w:val="20"/>
+        <w:szCs w:val="20"/>
+      </w:rPr>
+      <w:fldChar w:fldCharType="begin"/>
+    </w:r>
+    <w:r>
+      <w:rPr>
+        <w:rFonts w:asciiTheme="minorHAnsi" w:hAnsiTheme="minorHAnsi"/>
+        <w:color w:val="000000"/>
+        <w:sz w:val="20"/>
+        <w:szCs w:val="20"/>
+        <w:lang w:val="en-GB"/>
+      </w:rPr>
+      <w:instrText>PAGE</w:instrText>
+    </w:r>
+    <w:r>
+      <w:rPr>
+        <w:rFonts w:asciiTheme="minorHAnsi" w:hAnsiTheme="minorHAnsi"/>
+        <w:color w:val="000000"/>
+        <w:sz w:val="20"/>
+        <w:szCs w:val="20"/>
+      </w:rPr>
+      <w:fldChar w:fldCharType="separate"/>
+    </w:r>
+    <w:r>
+      <w:rPr>
+        <w:color w:val="000000"/>
+        <w:sz w:val="20"/>
+        <w:szCs w:val="20"/>
+        <w:lang w:val="en-GB"/>
+      </w:rPr>
+      <w:t>2</w:t>
+    </w:r>
+    <w:r>
+      <w:rPr>
+        <w:rFonts w:asciiTheme="minorHAnsi" w:hAnsiTheme="minorHAnsi"/>
+        <w:color w:val="000000"/>
+        <w:sz w:val="20"/>
+        <w:szCs w:val="20"/>
+      </w:rPr>
+      <w:fldChar w:fldCharType="end"/>
+    </w:r>
+    <w:r>
+      <w:rPr>
+        <w:rFonts w:asciiTheme="minorHAnsi" w:hAnsiTheme="minorHAnsi"/>
+        <w:color w:val="000000"/>
+        <w:sz w:val="20"/>
+        <w:szCs w:val="20"/>
+        <w:lang w:val="en-GB"/>
+      </w:rPr>
+      <w:t xml:space="preserve"> </w:t>
+    </w:r>
+    <w:r>
+      <w:rPr>
+        <w:rFonts w:asciiTheme="minorHAnsi" w:hAnsiTheme="minorHAnsi"/>
+        <w:color w:val="000000"/>
+        <w:sz w:val="20"/>
+        <w:szCs w:val="20"/>
+        <w:lang w:val="en-GB"/>
+      </w:rPr>
+      <w:t xml:space="preserve">/ </w:t>
+    </w:r>
+    <w:r>
+      <w:rPr>
+        <w:color w:val="000000"/>
+        <w:sz w:val="20"/>
+        <w:szCs w:val="20"/>
+      </w:rPr>
+      <w:fldChar w:fldCharType="begin"/>
+    </w:r>
+    <w:r>
+      <w:rPr>
+        <w:color w:val="000000"/>
+        <w:sz w:val="20"/>
+        <w:szCs w:val="20"/>
+        <w:lang w:val="en-GB"/>
+      </w:rPr>
+      <w:instrText xml:space="preserve"> NUMPAGES  \# "0" \* Arabic  \* MERGEFORMAT </w:instrText>
+    </w:r>
+    <w:r>
+      <w:rPr>
+        <w:color w:val="000000"/>
+        <w:sz w:val="20"/>
+        <w:szCs w:val="20"/>
+      </w:rPr>
+      <w:fldChar w:fldCharType="separate"/>
+    </w:r>
+    <w:r>
+      <w:rPr>
+        <w:color w:val="000000"/>
+        <w:sz w:val="20"/>
+        <w:szCs w:val="20"/>
+        <w:lang w:val="en-GB"/>
+      </w:rPr>
+      <w:t>4</w:t>
+    </w:r>
+    <w:r>
+      <w:rPr>
+        <w:color w:val="000000"/>
+        <w:sz w:val="20"/>
+        <w:szCs w:val="20"/>
+      </w:rPr>
+      <w:fldChar w:fldCharType="end"/>
+    </w:r>
+    <w:r>
+      <w:rPr>
+        <w:rFonts w:asciiTheme="minorHAnsi" w:hAnsiTheme="minorHAnsi"/>
+        <w:color w:val="000000"/>
+        <w:sz w:val="20"/>
+        <w:szCs w:val="20"/>
+        <w:lang w:val="en-GB"/>
+      </w:rPr>
+      <w:tab/>
+    </w:r>
+    <w:r>
+      <w:rPr>
+        <w:rFonts w:asciiTheme="minorHAnsi" w:hAnsiTheme="minorHAnsi"/>
+        <w:color w:val="000000"/>
+        <w:sz w:val="20"/>
+        <w:szCs w:val="20"/>
+        <w:lang w:val="en-GB"/>
+      </w:rPr>
+      <w:fldChar w:fldCharType="begin"/>
+    </w:r>
+    <w:r>
+      <w:rPr>
+        <w:rFonts w:asciiTheme="minorHAnsi" w:hAnsiTheme="minorHAnsi"/>
+        <w:color w:val="000000"/>
+        <w:sz w:val="20"/>
+        <w:szCs w:val="20"/>
+        <w:lang w:val="en-GB"/>
+      </w:rPr>
+      <w:instrText xml:space="preserve"> CREATEDATE \@ "yyyy-MM-dd" \* MERGEFORMAT </w:instrText>
+    </w:r>
+    <w:r>
+      <w:rPr>
+        <w:rFonts w:asciiTheme="minorHAnsi" w:hAnsiTheme="minorHAnsi"/>
+        <w:color w:val="000000"/>
+        <w:sz w:val="20"/>
+        <w:szCs w:val="20"/>
+        <w:lang w:val="en-GB"/>
+      </w:rPr>
+      <w:fldChar w:fldCharType="separate"/>
+    </w:r>
+    <w:r>
+      <w:rPr>
+        <w:rFonts w:asciiTheme="minorHAnsi" w:hAnsiTheme="minorHAnsi"/>
+        <w:noProof/>
+        <w:color w:val="000000"/>
+        <w:sz w:val="20"/>
+        <w:szCs w:val="20"/>
+        <w:lang w:val="en-GB"/>
+      </w:rPr>
+      <w:t>2026-03-</w:t>
+    </w:r>
+    <w:r>
+      <w:rPr>
+        <w:rFonts w:asciiTheme="minorHAnsi" w:hAnsiTheme="minorHAnsi"/>
+        <w:noProof/>
+        <w:color w:val="000000"/>
+        <w:sz w:val="20"/>
+        <w:szCs w:val="20"/>
+        <w:lang w:val="en-GB"/>
+      </w:rPr>
+      <w:t>31</w:t>
+    </w:r>
+    <w:r>
+      <w:rPr>
+        <w:rFonts w:asciiTheme="minorHAnsi" w:hAnsiTheme="minorHAnsi"/>
+        <w:color w:val="000000"/>
+        <w:sz w:val="20"/>
+        <w:szCs w:val="20"/>
+        <w:lang w:val="en-GB"/>
+      </w:rPr>
+      <w:fldChar w:fldCharType="end"/>
+    </w:r>
+  </w:p>
+  <w:p>
+    <w:pPr>
+      <w:pBdr>
+        <w:top w:val="single" w:sz="8" w:space="1" w:color="000000"/>
+        <w:left w:val="nil"/>
+        <w:bottom w:val="nil"/>
+        <w:right w:val="nil"/>
+        <w:between w:val="nil"/>
+      </w:pBdr>
+      <w:tabs>
+        <w:tab w:val="center" w:pos="4536"/>
+        <w:tab w:val="right" w:pos="9072"/>
+      </w:tabs>
+      <w:spacing w:after="0" w:line="240" w:lineRule="auto"/>
+      <w:rPr>
+        <w:rFonts w:asciiTheme="minorHAnsi" w:hAnsiTheme="minorHAnsi"/>
+        <w:color w:val="000000"/>
+        <w:sz w:val="20"/>
+        <w:szCs w:val="20"/>
+        <w:lang w:val="en-GB"/>
+      </w:rPr>
+    </w:pPr>
+    <w:r>
+      <w:rPr>
+        <w:rFonts w:asciiTheme="minorHAnsi" w:hAnsiTheme="minorHAnsi"/>
+        <w:color w:val="000000"/>
+        <w:sz w:val="20"/>
+        <w:szCs w:val="20"/>
+        <w:lang w:val="en-GB"/>
       </w:rPr>
       <w:t>© Polish Quality Board</w:t>
     </w:r>
@@ -2989,6 +3122,7 @@
       <w:jc w:val="center"/>
       <w:rPr>
         <w:color w:val="000000"/>
+        <w:lang w:val="en-GB"/>
       </w:rPr>
     </w:pPr>
   </w:p>
@@ -3062,6 +3196,16 @@
 </file>
 
 <file path=word/header1.xml><?xml version="1.0" encoding="utf-8"?>
+<w:hdr xmlns:wpc="http://schemas.microsoft.com/office/word/2010/wordprocessingCanvas" xmlns:cx="http://schemas.microsoft.com/office/drawing/2014/chartex" xmlns:cx1="http://schemas.microsoft.com/office/drawing/2015/9/8/chartex" xmlns:cx2="http://schemas.microsoft.com/office/drawing/2015/10/21/chartex" xmlns:cx3="http://schemas.microsoft.com/office/drawing/2016/5/9/chartex" xmlns:cx4="http://schemas.microsoft.com/office/drawing/2016/5/10/chartex" xmlns:cx5="http://schemas.microsoft.com/office/drawing/2016/5/11/chartex" xmlns:cx6="http://schemas.microsoft.com/office/drawing/2016/5/12/chartex" xmlns:cx7="http://schemas.microsoft.com/office/drawing/2016/5/13/chartex" xmlns:cx8="http://schemas.microsoft.com/office/drawing/2016/5/14/chartex" xmlns:mc="http://schemas.openxmlformats.org/markup-compatibility/2006" xmlns:aink="http://schemas.microsoft.com/office/drawing/2016/ink" xmlns:am3d="http://schemas.microsoft.com/office/drawing/2017/model3d" xmlns:o="urn:schemas-microsoft-com:office:office" xmlns:oel="http://schemas.microsoft.com/office/2019/extlst" xmlns:r="http://schemas.openxmlformats.org/officeDocument/2006/relationships" xmlns:m="http://schemas.openxmlformats.org/officeDocument/2006/math" xmlns:v="urn:schemas-microsoft-com:vml" xmlns:wp14="http://schemas.microsoft.com/office/word/2010/wordprocessingDrawing" xmlns:wp="http://schemas.openxmlformats.org/drawingml/2006/wordprocessingDrawing" xmlns:w10="urn:schemas-microsoft-com:office:word" xmlns:w="http://schemas.openxmlformats.org/wordprocessingml/2006/main" xmlns:w14="http://schemas.microsoft.com/office/word/2010/wordml" xmlns:w15="http://schemas.microsoft.com/office/word/2012/wordml" xmlns:w16cex="http://schemas.microsoft.com/office/word/2018/wordml/cex" xmlns:w16cid="http://schemas.microsoft.com/office/word/2016/wordml/cid" xmlns:w16="http://schemas.microsoft.com/office/word/2018/wordml" xmlns:w16du="http://schemas.microsoft.com/office/word/2023/wordml/word16du" xmlns:w16sdtdh="http://schemas.microsoft.com/office/word/2020/wordml/sdtdatahash" xmlns:w16sdtfl="http://schemas.microsoft.com/office/word/2024/wordml/sdtformatlock" xmlns:w16se="http://schemas.microsoft.com/office/word/2015/wordml/symex" xmlns:wpg="http://schemas.microsoft.com/office/word/2010/wordprocessingGroup" xmlns:wpi="http://schemas.microsoft.com/office/word/2010/wordprocessingInk" xmlns:wne="http://schemas.microsoft.com/office/word/2006/wordml" xmlns:wps="http://schemas.microsoft.com/office/word/2010/wordprocessingShape" mc:Ignorable="w14 w15 w16se w16cid w16 w16cex w16sdtdh w16sdtfl w16du wp14">
+  <w:p>
+    <w:pPr>
+      <w:pStyle w:val="Nagwek"/>
+    </w:pPr>
+  </w:p>
+</w:hdr>
+</file>
+
+<file path=word/header2.xml><?xml version="1.0" encoding="utf-8"?>
 <w:hdr xmlns:wpc="http://schemas.microsoft.com/office/word/2010/wordprocessingCanvas" xmlns:cx="http://schemas.microsoft.com/office/drawing/2014/chartex" xmlns:cx1="http://schemas.microsoft.com/office/drawing/2015/9/8/chartex" xmlns:cx2="http://schemas.microsoft.com/office/drawing/2015/10/21/chartex" xmlns:cx3="http://schemas.microsoft.com/office/drawing/2016/5/9/chartex" xmlns:cx4="http://schemas.microsoft.com/office/drawing/2016/5/10/chartex" xmlns:cx5="http://schemas.microsoft.com/office/drawing/2016/5/11/chartex" xmlns:cx6="http://schemas.microsoft.com/office/drawing/2016/5/12/chartex" xmlns:cx7="http://schemas.microsoft.com/office/drawing/2016/5/13/chartex" xmlns:cx8="http://schemas.microsoft.com/office/drawing/2016/5/14/chartex" xmlns:mc="http://schemas.openxmlformats.org/markup-compatibility/2006" xmlns:aink="http://schemas.microsoft.com/office/drawing/2016/ink" xmlns:am3d="http://schemas.microsoft.com/office/drawing/2017/model3d" xmlns:o="urn:schemas-microsoft-com:office:office" xmlns:oel="http://schemas.microsoft.com/office/2019/extlst" xmlns:r="http://schemas.openxmlformats.org/officeDocument/2006/relationships" xmlns:m="http://schemas.openxmlformats.org/officeDocument/2006/math" xmlns:v="urn:schemas-microsoft-com:vml" xmlns:wp14="http://schemas.microsoft.com/office/word/2010/wordprocessingDrawing" xmlns:wp="http://schemas.openxmlformats.org/drawingml/2006/wordprocessingDrawing" xmlns:w10="urn:schemas-microsoft-com:office:word" xmlns:w="http://schemas.openxmlformats.org/wordprocessingml/2006/main" xmlns:w14="http://schemas.microsoft.com/office/word/2010/wordml" xmlns:w15="http://schemas.microsoft.com/office/word/2012/wordml" xmlns:w16cex="http://schemas.microsoft.com/office/word/2018/wordml/cex" xmlns:w16cid="http://schemas.microsoft.com/office/word/2016/wordml/cid" xmlns:w16="http://schemas.microsoft.com/office/word/2018/wordml" xmlns:w16du="http://schemas.microsoft.com/office/word/2023/wordml/word16du" xmlns:w16sdtdh="http://schemas.microsoft.com/office/word/2020/wordml/sdtdatahash" xmlns:w16sdtfl="http://schemas.microsoft.com/office/word/2024/wordml/sdtformatlock" xmlns:w16se="http://schemas.microsoft.com/office/word/2015/wordml/symex" xmlns:wpg="http://schemas.microsoft.com/office/word/2010/wordprocessingGroup" xmlns:wpi="http://schemas.microsoft.com/office/word/2010/wordprocessingInk" xmlns:wne="http://schemas.microsoft.com/office/word/2006/wordml" xmlns:wps="http://schemas.microsoft.com/office/word/2010/wordprocessingShape" mc:Ignorable="w14 w15 w16se w16cid w16 w16cex w16sdtdh w16sdtfl w16du wp14">
   <w:p>
     <w:pPr>
@@ -3195,7 +3339,7 @@
 </w:hdr>
 </file>
 
-<file path=word/header2.xml><?xml version="1.0" encoding="utf-8"?>
+<file path=word/header3.xml><?xml version="1.0" encoding="utf-8"?>
 <w:hdr xmlns:wpc="http://schemas.microsoft.com/office/word/2010/wordprocessingCanvas" xmlns:cx="http://schemas.microsoft.com/office/drawing/2014/chartex" xmlns:cx1="http://schemas.microsoft.com/office/drawing/2015/9/8/chartex" xmlns:cx2="http://schemas.microsoft.com/office/drawing/2015/10/21/chartex" xmlns:cx3="http://schemas.microsoft.com/office/drawing/2016/5/9/chartex" xmlns:cx4="http://schemas.microsoft.com/office/drawing/2016/5/10/chartex" xmlns:cx5="http://schemas.microsoft.com/office/drawing/2016/5/11/chartex" xmlns:cx6="http://schemas.microsoft.com/office/drawing/2016/5/12/chartex" xmlns:cx7="http://schemas.microsoft.com/office/drawing/2016/5/13/chartex" xmlns:cx8="http://schemas.microsoft.com/office/drawing/2016/5/14/chartex" xmlns:mc="http://schemas.openxmlformats.org/markup-compatibility/2006" xmlns:aink="http://schemas.microsoft.com/office/drawing/2016/ink" xmlns:am3d="http://schemas.microsoft.com/office/drawing/2017/model3d" xmlns:o="urn:schemas-microsoft-com:office:office" xmlns:oel="http://schemas.microsoft.com/office/2019/extlst" xmlns:r="http://schemas.openxmlformats.org/officeDocument/2006/relationships" xmlns:m="http://schemas.openxmlformats.org/officeDocument/2006/math" xmlns:v="urn:schemas-microsoft-com:vml" xmlns:wp14="http://schemas.microsoft.com/office/word/2010/wordprocessingDrawing" xmlns:wp="http://schemas.openxmlformats.org/drawingml/2006/wordprocessingDrawing" xmlns:w10="urn:schemas-microsoft-com:office:word" xmlns:w="http://schemas.openxmlformats.org/wordprocessingml/2006/main" xmlns:w14="http://schemas.microsoft.com/office/word/2010/wordml" xmlns:w15="http://schemas.microsoft.com/office/word/2012/wordml" xmlns:w16cex="http://schemas.microsoft.com/office/word/2018/wordml/cex" xmlns:w16cid="http://schemas.microsoft.com/office/word/2016/wordml/cid" xmlns:w16="http://schemas.microsoft.com/office/word/2018/wordml" xmlns:w16du="http://schemas.microsoft.com/office/word/2023/wordml/word16du" xmlns:w16sdtdh="http://schemas.microsoft.com/office/word/2020/wordml/sdtdatahash" xmlns:w16sdtfl="http://schemas.microsoft.com/office/word/2024/wordml/sdtformatlock" xmlns:w16se="http://schemas.microsoft.com/office/word/2015/wordml/symex" xmlns:wpg="http://schemas.microsoft.com/office/word/2010/wordprocessingGroup" xmlns:wpi="http://schemas.microsoft.com/office/word/2010/wordprocessingInk" xmlns:wne="http://schemas.microsoft.com/office/word/2006/wordml" xmlns:wps="http://schemas.microsoft.com/office/word/2010/wordprocessingShape" mc:Ignorable="w14 w15 w16se w16cid w16 w16cex w16sdtdh w16sdtfl w16du wp14">
   <w:p>
     <w:pPr>
@@ -3256,27 +3400,7 @@
         <w:szCs w:val="20"/>
         <w:lang w:val="en-GB"/>
       </w:rPr>
-      <w:t xml:space="preserve">ul. H. </w:t>
-    </w:r>
-    <w:proofErr w:type="spellStart"/>
-    <w:r>
-      <w:rPr>
-        <w:color w:val="000000"/>
-        <w:sz w:val="20"/>
-        <w:szCs w:val="20"/>
-        <w:lang w:val="en-GB"/>
-      </w:rPr>
-      <w:t>Mrossa</w:t>
-    </w:r>
-    <w:proofErr w:type="spellEnd"/>
-    <w:r>
-      <w:rPr>
-        <w:color w:val="000000"/>
-        <w:sz w:val="20"/>
-        <w:szCs w:val="20"/>
-        <w:lang w:val="en-GB"/>
-      </w:rPr>
-      <w:t xml:space="preserve"> 4C/14</w:t>
+      <w:t>ul. H. Mrossa 4C/14</w:t>
     </w:r>
   </w:p>
   <w:p>
@@ -3365,20 +3489,8 @@
         <w:u w:val="single"/>
         <w:lang w:val="en-GB"/>
       </w:rPr>
-      <w:t xml:space="preserve">86-032 </w:t>
+      <w:t>86-032 Niemcz</w:t>
     </w:r>
-    <w:proofErr w:type="spellStart"/>
-    <w:r>
-      <w:rPr>
-        <w:color w:val="000000"/>
-        <w:sz w:val="20"/>
-        <w:szCs w:val="20"/>
-        <w:u w:val="single"/>
-        <w:lang w:val="en-GB"/>
-      </w:rPr>
-      <w:t>Niemcz</w:t>
-    </w:r>
-    <w:proofErr w:type="spellEnd"/>
   </w:p>
   <w:p>
     <w:pPr>
@@ -3481,102 +3593,6 @@
         <w:lang w:val="en-GB"/>
       </w:rPr>
     </w:pPr>
-    <w:r>
-      <w:rPr>
-        <w:noProof/>
-        <w:sz w:val="20"/>
-        <w:szCs w:val="20"/>
-      </w:rPr>
-      <mc:AlternateContent>
-        <mc:Choice Requires="wpg">
-          <w:drawing>
-            <wp:anchor distT="0" distB="0" distL="114300" distR="114300" simplePos="0" relativeHeight="251660288" behindDoc="0" locked="0" layoutInCell="1" hidden="0" allowOverlap="1" wp14:anchorId="70F8812F" wp14:editId="0880C8CF">
-              <wp:simplePos x="0" y="0"/>
-              <wp:positionH relativeFrom="column">
-                <wp:posOffset>-922653</wp:posOffset>
-              </wp:positionH>
-              <wp:positionV relativeFrom="paragraph">
-                <wp:posOffset>433705</wp:posOffset>
-              </wp:positionV>
-              <wp:extent cx="6690360" cy="64770"/>
-              <wp:effectExtent l="0" t="0" r="0" b="0"/>
-              <wp:wrapNone/>
-              <wp:docPr id="1925692981" name="Łącznik prosty ze strzałką 1925692981"/>
-              <wp:cNvGraphicFramePr/>
-              <a:graphic xmlns:a="http://schemas.openxmlformats.org/drawingml/2006/main">
-                <a:graphicData uri="http://schemas.microsoft.com/office/word/2010/wordprocessingShape">
-                  <wps:wsp>
-                    <wps:cNvCnPr/>
-                    <wps:spPr>
-                      <a:xfrm>
-                        <a:off x="2019870" y="3766665"/>
-                        <a:ext cx="6652260" cy="26670"/>
-                      </a:xfrm>
-                      <a:prstGeom prst="straightConnector1">
-                        <a:avLst/>
-                      </a:prstGeom>
-                      <a:noFill/>
-                      <a:ln w="38100" cap="flat" cmpd="sng">
-                        <a:solidFill>
-                          <a:srgbClr val="003F76"/>
-                        </a:solidFill>
-                        <a:prstDash val="solid"/>
-                        <a:miter lim="800000"/>
-                        <a:headEnd type="none" w="sm" len="sm"/>
-                        <a:tailEnd type="none" w="sm" len="sm"/>
-                      </a:ln>
-                    </wps:spPr>
-                    <wps:bodyPr/>
-                  </wps:wsp>
-                </a:graphicData>
-              </a:graphic>
-            </wp:anchor>
-          </w:drawing>
-        </mc:Choice>
-        <mc:Fallback xmlns:cr="http://schemas.microsoft.com/office/comments/2020/reactions" xmlns="http://schemas.microsoft.com/office/tasks/2019/documenttasks" xmlns:dgm="http://schemas.openxmlformats.org/drawingml/2006/diagram" xmlns:lc="http://schemas.openxmlformats.org/drawingml/2006/lockedCanvas" xmlns:c="http://schemas.openxmlformats.org/drawingml/2006/chart" xmlns:pic="http://schemas.openxmlformats.org/drawingml/2006/picture" xmlns:a="http://schemas.openxmlformats.org/drawingml/2006/main" xmlns:sl="http://schemas.openxmlformats.org/schemaLibrary/2006/main">
-          <w:drawing>
-            <wp:anchor allowOverlap="1" behindDoc="0" distB="0" distT="0" distL="114300" distR="114300" hidden="0" layoutInCell="1" locked="0" relativeHeight="0" simplePos="0">
-              <wp:simplePos x="0" y="0"/>
-              <wp:positionH relativeFrom="column">
-                <wp:posOffset>-922653</wp:posOffset>
-              </wp:positionH>
-              <wp:positionV relativeFrom="paragraph">
-                <wp:posOffset>433705</wp:posOffset>
-              </wp:positionV>
-              <wp:extent cx="6690360" cy="64770"/>
-              <wp:effectExtent b="0" l="0" r="0" t="0"/>
-              <wp:wrapNone/>
-              <wp:docPr id="1925692981" name="image2.png"/>
-              <a:graphic>
-                <a:graphicData uri="http://schemas.openxmlformats.org/drawingml/2006/picture">
-                  <pic:pic>
-                    <pic:nvPicPr>
-                      <pic:cNvPr id="0" name="image2.png"/>
-                      <pic:cNvPicPr preferRelativeResize="0"/>
-                    </pic:nvPicPr>
-                    <pic:blipFill>
-                      <a:blip r:embed="rId2"/>
-                      <a:srcRect/>
-                      <a:stretch>
-                        <a:fillRect/>
-                      </a:stretch>
-                    </pic:blipFill>
-                    <pic:spPr>
-                      <a:xfrm>
-                        <a:off x="0" y="0"/>
-                        <a:ext cx="6690360" cy="64770"/>
-                      </a:xfrm>
-                      <a:prstGeom prst="rect"/>
-                      <a:ln/>
-                    </pic:spPr>
-                  </pic:pic>
-                </a:graphicData>
-              </a:graphic>
-            </wp:anchor>
-          </w:drawing>
-        </mc:Fallback>
-      </mc:AlternateContent>
-    </w:r>
   </w:p>
   <w:p>
     <w:pPr>
@@ -3627,6 +3643,86 @@
         <w:szCs w:val="20"/>
       </w:rPr>
     </w:pPr>
+    <w:r>
+      <w:rPr>
+        <w:noProof/>
+        <w:color w:val="000000"/>
+      </w:rPr>
+      <mc:AlternateContent>
+        <mc:Choice Requires="wps">
+          <w:drawing>
+            <wp:anchor distT="0" distB="0" distL="114300" distR="114300" simplePos="0" relativeHeight="251661312" behindDoc="0" locked="0" layoutInCell="1" allowOverlap="1" wp14:anchorId="09146562" wp14:editId="78E808AD">
+              <wp:simplePos x="0" y="0"/>
+              <wp:positionH relativeFrom="margin">
+                <wp:posOffset>-887730</wp:posOffset>
+              </wp:positionH>
+              <wp:positionV relativeFrom="paragraph">
+                <wp:posOffset>89535</wp:posOffset>
+              </wp:positionV>
+              <wp:extent cx="6667500" cy="45720"/>
+              <wp:effectExtent l="0" t="0" r="19050" b="11430"/>
+              <wp:wrapNone/>
+              <wp:docPr id="361743798" name="Prostokąt 2"/>
+              <wp:cNvGraphicFramePr/>
+              <a:graphic xmlns:a="http://schemas.openxmlformats.org/drawingml/2006/main">
+                <a:graphicData uri="http://schemas.microsoft.com/office/word/2010/wordprocessingShape">
+                  <wps:wsp>
+                    <wps:cNvSpPr/>
+                    <wps:spPr>
+                      <a:xfrm>
+                        <a:off x="0" y="0"/>
+                        <a:ext cx="6667500" cy="45720"/>
+                      </a:xfrm>
+                      <a:prstGeom prst="rect">
+                        <a:avLst/>
+                      </a:prstGeom>
+                      <a:solidFill>
+                        <a:srgbClr val="0D3063"/>
+                      </a:solidFill>
+                    </wps:spPr>
+                    <wps:style>
+                      <a:lnRef idx="2">
+                        <a:schemeClr val="accent1">
+                          <a:shade val="15000"/>
+                        </a:schemeClr>
+                      </a:lnRef>
+                      <a:fillRef idx="1">
+                        <a:schemeClr val="accent1"/>
+                      </a:fillRef>
+                      <a:effectRef idx="0">
+                        <a:schemeClr val="accent1"/>
+                      </a:effectRef>
+                      <a:fontRef idx="minor">
+                        <a:schemeClr val="lt1"/>
+                      </a:fontRef>
+                    </wps:style>
+                    <wps:bodyPr rot="0" spcFirstLastPara="0" vertOverflow="overflow" horzOverflow="overflow" vert="horz" wrap="square" lIns="91440" tIns="45720" rIns="91440" bIns="45720" numCol="1" spcCol="0" rtlCol="0" fromWordArt="0" anchor="ctr" anchorCtr="0" forceAA="0" compatLnSpc="1">
+                      <a:prstTxWarp prst="textNoShape">
+                        <a:avLst/>
+                      </a:prstTxWarp>
+                      <a:noAutofit/>
+                    </wps:bodyPr>
+                  </wps:wsp>
+                </a:graphicData>
+              </a:graphic>
+              <wp14:sizeRelH relativeFrom="margin">
+                <wp14:pctWidth>0</wp14:pctWidth>
+              </wp14:sizeRelH>
+              <wp14:sizeRelV relativeFrom="margin">
+                <wp14:pctHeight>0</wp14:pctHeight>
+              </wp14:sizeRelV>
+            </wp:anchor>
+          </w:drawing>
+        </mc:Choice>
+        <mc:Fallback>
+          <w:pict>
+            <v:rect w14:anchorId="10D1150C" id="Prostokąt 2" o:spid="_x0000_s1026" style="position:absolute;margin-left:-69.9pt;margin-top:7.05pt;width:525pt;height:3.6pt;z-index:251661312;visibility:visible;mso-wrap-style:square;mso-width-percent:0;mso-height-percent:0;mso-wrap-distance-left:9pt;mso-wrap-distance-top:0;mso-wrap-distance-right:9pt;mso-wrap-distance-bottom:0;mso-position-horizontal:absolute;mso-position-horizontal-relative:margin;mso-position-vertical:absolute;mso-position-vertical-relative:text;mso-width-percent:0;mso-height-percent:0;mso-width-relative:margin;mso-height-relative:margin;v-text-anchor:middle" o:gfxdata="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" fillcolor="#0d3063" strokecolor="#030e13 [484]" strokeweight="1pt">
+              <w10:wrap anchorx="margin"/>
+            </v:rect>
+          </w:pict>
+        </mc:Fallback>
+      </mc:AlternateContent>
+    </w:r>
   </w:p>
 </w:hdr>
 </file>
@@ -4495,14 +4591,14 @@
     <w:lsdException w:name="Unresolved Mention" w:semiHidden="1" w:unhideWhenUsed="1"/>
     <w:lsdException w:name="Smart Link" w:semiHidden="1" w:unhideWhenUsed="1"/>
   </w:latentStyles>
-  <w:style w:type="paragraph" w:default="1" w:styleId="Normal">
+  <w:style w:type="paragraph" w:default="1" w:styleId="Normalny">
     <w:name w:val="Normal"/>
     <w:qFormat/>
   </w:style>
-  <w:style w:type="paragraph" w:styleId="Heading1">
+  <w:style w:type="paragraph" w:styleId="Nagwek1">
     <w:name w:val="heading 1"/>
-    <w:basedOn w:val="Normal"/>
-    <w:next w:val="Normal"/>
+    <w:basedOn w:val="Normalny"/>
+    <w:next w:val="Normalny"/>
     <w:uiPriority w:val="9"/>
     <w:qFormat/>
     <w:pPr>
@@ -4525,10 +4621,10 @@
       <w:szCs w:val="40"/>
     </w:rPr>
   </w:style>
-  <w:style w:type="paragraph" w:styleId="Heading2">
+  <w:style w:type="paragraph" w:styleId="Nagwek2">
     <w:name w:val="heading 2"/>
-    <w:basedOn w:val="Normal"/>
-    <w:next w:val="Normal"/>
+    <w:basedOn w:val="Normalny"/>
+    <w:next w:val="Normalny"/>
     <w:uiPriority w:val="9"/>
     <w:semiHidden/>
     <w:unhideWhenUsed/>
@@ -4547,10 +4643,10 @@
       <w:szCs w:val="32"/>
     </w:rPr>
   </w:style>
-  <w:style w:type="paragraph" w:styleId="Heading3">
+  <w:style w:type="paragraph" w:styleId="Nagwek3">
     <w:name w:val="heading 3"/>
-    <w:basedOn w:val="Normal"/>
-    <w:next w:val="Normal"/>
+    <w:basedOn w:val="Normalny"/>
+    <w:next w:val="Normalny"/>
     <w:uiPriority w:val="9"/>
     <w:semiHidden/>
     <w:unhideWhenUsed/>
@@ -4568,10 +4664,10 @@
       <w:szCs w:val="28"/>
     </w:rPr>
   </w:style>
-  <w:style w:type="paragraph" w:styleId="Heading4">
+  <w:style w:type="paragraph" w:styleId="Nagwek4">
     <w:name w:val="heading 4"/>
-    <w:basedOn w:val="Normal"/>
-    <w:next w:val="Normal"/>
+    <w:basedOn w:val="Normalny"/>
+    <w:next w:val="Normalny"/>
     <w:uiPriority w:val="9"/>
     <w:semiHidden/>
     <w:unhideWhenUsed/>
@@ -4588,10 +4684,10 @@
       <w:color w:val="0F4761"/>
     </w:rPr>
   </w:style>
-  <w:style w:type="paragraph" w:styleId="Heading5">
+  <w:style w:type="paragraph" w:styleId="Nagwek5">
     <w:name w:val="heading 5"/>
-    <w:basedOn w:val="Normal"/>
-    <w:next w:val="Normal"/>
+    <w:basedOn w:val="Normalny"/>
+    <w:next w:val="Normalny"/>
     <w:uiPriority w:val="9"/>
     <w:semiHidden/>
     <w:unhideWhenUsed/>
@@ -4606,10 +4702,10 @@
       <w:color w:val="0F4761"/>
     </w:rPr>
   </w:style>
-  <w:style w:type="paragraph" w:styleId="Heading6">
+  <w:style w:type="paragraph" w:styleId="Nagwek6">
     <w:name w:val="heading 6"/>
-    <w:basedOn w:val="Normal"/>
-    <w:next w:val="Normal"/>
+    <w:basedOn w:val="Normalny"/>
+    <w:next w:val="Normalny"/>
     <w:uiPriority w:val="9"/>
     <w:semiHidden/>
     <w:unhideWhenUsed/>
@@ -4626,9 +4722,9 @@
       <w:color w:val="595959"/>
     </w:rPr>
   </w:style>
-  <w:style w:type="paragraph" w:styleId="Heading7">
+  <w:style w:type="paragraph" w:styleId="Nagwek7">
     <w:name w:val="heading 7"/>
-    <w:link w:val="Heading7Char"/>
+    <w:link w:val="Nagwek7Znak"/>
     <w:uiPriority w:val="9"/>
     <w:semiHidden/>
     <w:unhideWhenUsed/>
@@ -4645,9 +4741,9 @@
       <w:color w:val="595959" w:themeColor="text1" w:themeTint="A6"/>
     </w:rPr>
   </w:style>
-  <w:style w:type="paragraph" w:styleId="Heading8">
+  <w:style w:type="paragraph" w:styleId="Nagwek8">
     <w:name w:val="heading 8"/>
-    <w:link w:val="Heading8Char"/>
+    <w:link w:val="Nagwek8Znak"/>
     <w:uiPriority w:val="9"/>
     <w:semiHidden/>
     <w:unhideWhenUsed/>
@@ -4666,9 +4762,9 @@
       <w:color w:val="272727" w:themeColor="text1" w:themeTint="D8"/>
     </w:rPr>
   </w:style>
-  <w:style w:type="paragraph" w:styleId="Heading9">
+  <w:style w:type="paragraph" w:styleId="Nagwek9">
     <w:name w:val="heading 9"/>
-    <w:link w:val="Heading9Char"/>
+    <w:link w:val="Nagwek9Znak"/>
     <w:uiPriority w:val="9"/>
     <w:semiHidden/>
     <w:unhideWhenUsed/>
@@ -4685,13 +4781,13 @@
       <w:color w:val="272727" w:themeColor="text1" w:themeTint="D8"/>
     </w:rPr>
   </w:style>
-  <w:style w:type="character" w:default="1" w:styleId="DefaultParagraphFont">
+  <w:style w:type="character" w:default="1" w:styleId="Domylnaczcionkaakapitu">
     <w:name w:val="Default Paragraph Font"/>
     <w:uiPriority w:val="1"/>
     <w:semiHidden/>
     <w:unhideWhenUsed/>
   </w:style>
-  <w:style w:type="table" w:default="1" w:styleId="TableNormal">
+  <w:style w:type="table" w:default="1" w:styleId="Standardowy">
     <w:name w:val="Normal Table"/>
     <w:uiPriority w:val="99"/>
     <w:semiHidden/>
@@ -4706,13 +4802,13 @@
       </w:tblCellMar>
     </w:tblPr>
   </w:style>
-  <w:style w:type="numbering" w:default="1" w:styleId="NoList">
+  <w:style w:type="numbering" w:default="1" w:styleId="Bezlisty">
     <w:name w:val="No List"/>
     <w:uiPriority w:val="99"/>
     <w:semiHidden/>
     <w:unhideWhenUsed/>
   </w:style>
-  <w:style w:type="table" w:customStyle="1" w:styleId="TableNormal0">
+  <w:style w:type="table" w:customStyle="1" w:styleId="TableNormal">
     <w:name w:val="TableNormal"/>
     <w:tblPr>
       <w:tblCellMar>
@@ -4723,10 +4819,10 @@
       </w:tblCellMar>
     </w:tblPr>
   </w:style>
-  <w:style w:type="paragraph" w:styleId="Title">
+  <w:style w:type="paragraph" w:styleId="Tytu">
     <w:name w:val="Title"/>
-    <w:basedOn w:val="Normal"/>
-    <w:next w:val="Normal"/>
+    <w:basedOn w:val="Normalny"/>
+    <w:next w:val="Normalny"/>
     <w:uiPriority w:val="10"/>
     <w:qFormat/>
     <w:pPr>
@@ -4740,7 +4836,7 @@
   </w:style>
   <w:style w:type="character" w:customStyle="1" w:styleId="Nagwek1Znak">
     <w:name w:val="Nagłówek 1 Znak"/>
-    <w:basedOn w:val="DefaultParagraphFont"/>
+    <w:basedOn w:val="Domylnaczcionkaakapitu"/>
     <w:uiPriority w:val="9"/>
     <w:rsid w:val="00B5094A"/>
     <w:rPr>
@@ -4752,7 +4848,7 @@
   </w:style>
   <w:style w:type="character" w:customStyle="1" w:styleId="Nagwek2Znak">
     <w:name w:val="Nagłówek 2 Znak"/>
-    <w:basedOn w:val="DefaultParagraphFont"/>
+    <w:basedOn w:val="Domylnaczcionkaakapitu"/>
     <w:uiPriority w:val="9"/>
     <w:rsid w:val="00656F16"/>
     <w:rPr>
@@ -4764,7 +4860,7 @@
   </w:style>
   <w:style w:type="character" w:customStyle="1" w:styleId="Nagwek3Znak">
     <w:name w:val="Nagłówek 3 Znak"/>
-    <w:basedOn w:val="DefaultParagraphFont"/>
+    <w:basedOn w:val="Domylnaczcionkaakapitu"/>
     <w:uiPriority w:val="9"/>
     <w:rsid w:val="00656F16"/>
     <w:rPr>
@@ -4776,7 +4872,7 @@
   </w:style>
   <w:style w:type="character" w:customStyle="1" w:styleId="Nagwek4Znak">
     <w:name w:val="Nagłówek 4 Znak"/>
-    <w:basedOn w:val="DefaultParagraphFont"/>
+    <w:basedOn w:val="Domylnaczcionkaakapitu"/>
     <w:uiPriority w:val="9"/>
     <w:semiHidden/>
     <w:rsid w:val="00EF77DA"/>
@@ -4789,7 +4885,7 @@
   </w:style>
   <w:style w:type="character" w:customStyle="1" w:styleId="Nagwek5Znak">
     <w:name w:val="Nagłówek 5 Znak"/>
-    <w:basedOn w:val="DefaultParagraphFont"/>
+    <w:basedOn w:val="Domylnaczcionkaakapitu"/>
     <w:uiPriority w:val="9"/>
     <w:semiHidden/>
     <w:rsid w:val="00EF77DA"/>
@@ -4800,7 +4896,7 @@
   </w:style>
   <w:style w:type="character" w:customStyle="1" w:styleId="Nagwek6Znak">
     <w:name w:val="Nagłówek 6 Znak"/>
-    <w:basedOn w:val="DefaultParagraphFont"/>
+    <w:basedOn w:val="Domylnaczcionkaakapitu"/>
     <w:uiPriority w:val="9"/>
     <w:semiHidden/>
     <w:rsid w:val="00EF77DA"/>
@@ -4811,10 +4907,10 @@
       <w:color w:val="595959" w:themeColor="text1" w:themeTint="A6"/>
     </w:rPr>
   </w:style>
-  <w:style w:type="character" w:customStyle="1" w:styleId="Heading7Char">
-    <w:name w:val="Heading 7 Char"/>
-    <w:basedOn w:val="DefaultParagraphFont"/>
-    <w:link w:val="Heading7"/>
+  <w:style w:type="character" w:customStyle="1" w:styleId="Nagwek7Znak">
+    <w:name w:val="Nagłówek 7 Znak"/>
+    <w:basedOn w:val="Domylnaczcionkaakapitu"/>
+    <w:link w:val="Nagwek7"/>
     <w:uiPriority w:val="9"/>
     <w:semiHidden/>
     <w:rsid w:val="00EF77DA"/>
@@ -4823,10 +4919,10 @@
       <w:color w:val="595959" w:themeColor="text1" w:themeTint="A6"/>
     </w:rPr>
   </w:style>
-  <w:style w:type="character" w:customStyle="1" w:styleId="Heading8Char">
-    <w:name w:val="Heading 8 Char"/>
-    <w:basedOn w:val="DefaultParagraphFont"/>
-    <w:link w:val="Heading8"/>
+  <w:style w:type="character" w:customStyle="1" w:styleId="Nagwek8Znak">
+    <w:name w:val="Nagłówek 8 Znak"/>
+    <w:basedOn w:val="Domylnaczcionkaakapitu"/>
+    <w:link w:val="Nagwek8"/>
     <w:uiPriority w:val="9"/>
     <w:semiHidden/>
     <w:rsid w:val="00EF77DA"/>
@@ -4837,10 +4933,10 @@
       <w:color w:val="272727" w:themeColor="text1" w:themeTint="D8"/>
     </w:rPr>
   </w:style>
-  <w:style w:type="character" w:customStyle="1" w:styleId="Heading9Char">
-    <w:name w:val="Heading 9 Char"/>
-    <w:basedOn w:val="DefaultParagraphFont"/>
-    <w:link w:val="Heading9"/>
+  <w:style w:type="character" w:customStyle="1" w:styleId="Nagwek9Znak">
+    <w:name w:val="Nagłówek 9 Znak"/>
+    <w:basedOn w:val="Domylnaczcionkaakapitu"/>
+    <w:link w:val="Nagwek9"/>
     <w:uiPriority w:val="9"/>
     <w:semiHidden/>
     <w:rsid w:val="00EF77DA"/>
@@ -4851,7 +4947,7 @@
   </w:style>
   <w:style w:type="character" w:customStyle="1" w:styleId="TytuZnak">
     <w:name w:val="Tytuł Znak"/>
-    <w:basedOn w:val="DefaultParagraphFont"/>
+    <w:basedOn w:val="Domylnaczcionkaakapitu"/>
     <w:uiPriority w:val="10"/>
     <w:rsid w:val="00EF77DA"/>
     <w:rPr>
@@ -4864,7 +4960,7 @@
   </w:style>
   <w:style w:type="character" w:customStyle="1" w:styleId="PodtytuZnak">
     <w:name w:val="Podtytuł Znak"/>
-    <w:basedOn w:val="DefaultParagraphFont"/>
+    <w:basedOn w:val="Domylnaczcionkaakapitu"/>
     <w:uiPriority w:val="11"/>
     <w:rsid w:val="00EF77DA"/>
     <w:rPr>
@@ -4875,9 +4971,9 @@
       <w:szCs w:val="28"/>
     </w:rPr>
   </w:style>
-  <w:style w:type="paragraph" w:styleId="Quote">
+  <w:style w:type="paragraph" w:styleId="Cytat">
     <w:name w:val="Quote"/>
-    <w:link w:val="QuoteChar"/>
+    <w:link w:val="CytatZnak"/>
     <w:uiPriority w:val="29"/>
     <w:qFormat/>
     <w:rsid w:val="00EF77DA"/>
@@ -4891,10 +4987,10 @@
       <w:color w:val="404040" w:themeColor="text1" w:themeTint="BF"/>
     </w:rPr>
   </w:style>
-  <w:style w:type="character" w:customStyle="1" w:styleId="QuoteChar">
-    <w:name w:val="Quote Char"/>
-    <w:basedOn w:val="DefaultParagraphFont"/>
-    <w:link w:val="Quote"/>
+  <w:style w:type="character" w:customStyle="1" w:styleId="CytatZnak">
+    <w:name w:val="Cytat Znak"/>
+    <w:basedOn w:val="Domylnaczcionkaakapitu"/>
+    <w:link w:val="Cytat"/>
     <w:uiPriority w:val="29"/>
     <w:rsid w:val="00EF77DA"/>
     <w:rPr>
@@ -4903,7 +4999,7 @@
       <w:color w:val="404040" w:themeColor="text1" w:themeTint="BF"/>
     </w:rPr>
   </w:style>
-  <w:style w:type="paragraph" w:styleId="ListParagraph">
+  <w:style w:type="paragraph" w:styleId="Akapitzlist">
     <w:name w:val="List Paragraph"/>
     <w:uiPriority w:val="34"/>
     <w:qFormat/>
@@ -4913,9 +5009,9 @@
       <w:contextualSpacing/>
     </w:pPr>
   </w:style>
-  <w:style w:type="character" w:styleId="IntenseEmphasis">
+  <w:style w:type="character" w:styleId="Wyrnienieintensywne">
     <w:name w:val="Intense Emphasis"/>
-    <w:basedOn w:val="DefaultParagraphFont"/>
+    <w:basedOn w:val="Domylnaczcionkaakapitu"/>
     <w:uiPriority w:val="21"/>
     <w:qFormat/>
     <w:rsid w:val="00EF77DA"/>
@@ -4925,9 +5021,9 @@
       <w:color w:val="0F4761" w:themeColor="accent1" w:themeShade="BF"/>
     </w:rPr>
   </w:style>
-  <w:style w:type="paragraph" w:styleId="IntenseQuote">
+  <w:style w:type="paragraph" w:styleId="Cytatintensywny">
     <w:name w:val="Intense Quote"/>
-    <w:link w:val="IntenseQuoteChar"/>
+    <w:link w:val="CytatintensywnyZnak"/>
     <w:uiPriority w:val="30"/>
     <w:qFormat/>
     <w:rsid w:val="00EF77DA"/>
@@ -4946,10 +5042,10 @@
       <w:color w:val="0F4761" w:themeColor="accent1" w:themeShade="BF"/>
     </w:rPr>
   </w:style>
-  <w:style w:type="character" w:customStyle="1" w:styleId="IntenseQuoteChar">
-    <w:name w:val="Intense Quote Char"/>
-    <w:basedOn w:val="DefaultParagraphFont"/>
-    <w:link w:val="IntenseQuote"/>
+  <w:style w:type="character" w:customStyle="1" w:styleId="CytatintensywnyZnak">
+    <w:name w:val="Cytat intensywny Znak"/>
+    <w:basedOn w:val="Domylnaczcionkaakapitu"/>
+    <w:link w:val="Cytatintensywny"/>
     <w:uiPriority w:val="30"/>
     <w:rsid w:val="00EF77DA"/>
     <w:rPr>
@@ -4958,9 +5054,9 @@
       <w:color w:val="0F4761" w:themeColor="accent1" w:themeShade="BF"/>
     </w:rPr>
   </w:style>
-  <w:style w:type="character" w:styleId="IntenseReference">
+  <w:style w:type="character" w:styleId="Odwoanieintensywne">
     <w:name w:val="Intense Reference"/>
-    <w:basedOn w:val="DefaultParagraphFont"/>
+    <w:basedOn w:val="Domylnaczcionkaakapitu"/>
     <w:uiPriority w:val="32"/>
     <w:qFormat/>
     <w:rsid w:val="00EF77DA"/>
@@ -4972,9 +5068,9 @@
       <w:spacing w:val="5"/>
     </w:rPr>
   </w:style>
-  <w:style w:type="paragraph" w:styleId="Header">
+  <w:style w:type="paragraph" w:styleId="Nagwek">
     <w:name w:val="header"/>
-    <w:link w:val="HeaderChar"/>
+    <w:link w:val="NagwekZnak"/>
     <w:uiPriority w:val="99"/>
     <w:unhideWhenUsed/>
     <w:rsid w:val="00EF77DA"/>
@@ -4986,16 +5082,16 @@
       <w:spacing w:after="0" w:line="240" w:lineRule="auto"/>
     </w:pPr>
   </w:style>
-  <w:style w:type="character" w:customStyle="1" w:styleId="HeaderChar">
-    <w:name w:val="Header Char"/>
-    <w:basedOn w:val="DefaultParagraphFont"/>
-    <w:link w:val="Header"/>
+  <w:style w:type="character" w:customStyle="1" w:styleId="NagwekZnak">
+    <w:name w:val="Nagłówek Znak"/>
+    <w:basedOn w:val="Domylnaczcionkaakapitu"/>
+    <w:link w:val="Nagwek"/>
     <w:uiPriority w:val="99"/>
     <w:rsid w:val="00EF77DA"/>
   </w:style>
-  <w:style w:type="paragraph" w:styleId="Footer">
+  <w:style w:type="paragraph" w:styleId="Stopka">
     <w:name w:val="footer"/>
-    <w:link w:val="FooterChar"/>
+    <w:link w:val="StopkaZnak"/>
     <w:uiPriority w:val="99"/>
     <w:unhideWhenUsed/>
     <w:rsid w:val="00EF77DA"/>
@@ -5007,16 +5103,16 @@
       <w:spacing w:after="0" w:line="240" w:lineRule="auto"/>
     </w:pPr>
   </w:style>
-  <w:style w:type="character" w:customStyle="1" w:styleId="FooterChar">
-    <w:name w:val="Footer Char"/>
-    <w:basedOn w:val="DefaultParagraphFont"/>
-    <w:link w:val="Footer"/>
+  <w:style w:type="character" w:customStyle="1" w:styleId="StopkaZnak">
+    <w:name w:val="Stopka Znak"/>
+    <w:basedOn w:val="Domylnaczcionkaakapitu"/>
+    <w:link w:val="Stopka"/>
     <w:uiPriority w:val="99"/>
     <w:rsid w:val="00EF77DA"/>
   </w:style>
-  <w:style w:type="table" w:styleId="TableGrid">
+  <w:style w:type="table" w:styleId="Tabela-Siatka">
     <w:name w:val="Table Grid"/>
-    <w:basedOn w:val="TableNormal"/>
+    <w:basedOn w:val="Standardowy"/>
     <w:uiPriority w:val="39"/>
     <w:rsid w:val="00E32A18"/>
     <w:pPr>
@@ -5033,7 +5129,7 @@
       </w:tblBorders>
     </w:tblPr>
   </w:style>
-  <w:style w:type="paragraph" w:styleId="TOCHeading">
+  <w:style w:type="paragraph" w:styleId="Nagwekspisutreci">
     <w:name w:val="TOC Heading"/>
     <w:uiPriority w:val="39"/>
     <w:unhideWhenUsed/>
@@ -5047,7 +5143,7 @@
       <w:szCs w:val="32"/>
     </w:rPr>
   </w:style>
-  <w:style w:type="paragraph" w:styleId="TOC1">
+  <w:style w:type="paragraph" w:styleId="Spistreci1">
     <w:name w:val="toc 1"/>
     <w:autoRedefine/>
     <w:uiPriority w:val="39"/>
@@ -5057,7 +5153,7 @@
       <w:spacing w:after="100"/>
     </w:pPr>
   </w:style>
-  <w:style w:type="paragraph" w:styleId="TOC2">
+  <w:style w:type="paragraph" w:styleId="Spistreci2">
     <w:name w:val="toc 2"/>
     <w:autoRedefine/>
     <w:uiPriority w:val="39"/>
@@ -5068,7 +5164,7 @@
       <w:ind w:left="220"/>
     </w:pPr>
   </w:style>
-  <w:style w:type="paragraph" w:styleId="TOC3">
+  <w:style w:type="paragraph" w:styleId="Spistreci3">
     <w:name w:val="toc 3"/>
     <w:autoRedefine/>
     <w:uiPriority w:val="39"/>
@@ -5079,9 +5175,9 @@
       <w:ind w:left="440"/>
     </w:pPr>
   </w:style>
-  <w:style w:type="character" w:styleId="Hyperlink">
+  <w:style w:type="character" w:styleId="Hipercze">
     <w:name w:val="Hyperlink"/>
-    <w:basedOn w:val="DefaultParagraphFont"/>
+    <w:basedOn w:val="Domylnaczcionkaakapitu"/>
     <w:uiPriority w:val="99"/>
     <w:unhideWhenUsed/>
     <w:rsid w:val="00E32A18"/>
@@ -5090,7 +5186,7 @@
       <w:u w:val="single"/>
     </w:rPr>
   </w:style>
-  <w:style w:type="paragraph" w:styleId="TOC4">
+  <w:style w:type="paragraph" w:styleId="Spistreci4">
     <w:name w:val="toc 4"/>
     <w:autoRedefine/>
     <w:uiPriority w:val="39"/>
@@ -5106,7 +5202,7 @@
       <w:szCs w:val="24"/>
     </w:rPr>
   </w:style>
-  <w:style w:type="paragraph" w:styleId="TOC5">
+  <w:style w:type="paragraph" w:styleId="Spistreci5">
     <w:name w:val="toc 5"/>
     <w:autoRedefine/>
     <w:uiPriority w:val="39"/>
@@ -5122,7 +5218,7 @@
       <w:szCs w:val="24"/>
     </w:rPr>
   </w:style>
-  <w:style w:type="paragraph" w:styleId="TOC6">
+  <w:style w:type="paragraph" w:styleId="Spistreci6">
     <w:name w:val="toc 6"/>
     <w:autoRedefine/>
     <w:uiPriority w:val="39"/>
@@ -5138,7 +5234,7 @@
       <w:szCs w:val="24"/>
     </w:rPr>
   </w:style>
-  <w:style w:type="paragraph" w:styleId="TOC7">
+  <w:style w:type="paragraph" w:styleId="Spistreci7">
     <w:name w:val="toc 7"/>
     <w:autoRedefine/>
     <w:uiPriority w:val="39"/>
@@ -5154,7 +5250,7 @@
       <w:szCs w:val="24"/>
     </w:rPr>
   </w:style>
-  <w:style w:type="paragraph" w:styleId="TOC8">
+  <w:style w:type="paragraph" w:styleId="Spistreci8">
     <w:name w:val="toc 8"/>
     <w:autoRedefine/>
     <w:uiPriority w:val="39"/>
@@ -5170,7 +5266,7 @@
       <w:szCs w:val="24"/>
     </w:rPr>
   </w:style>
-  <w:style w:type="paragraph" w:styleId="TOC9">
+  <w:style w:type="paragraph" w:styleId="Spistreci9">
     <w:name w:val="toc 9"/>
     <w:autoRedefine/>
     <w:uiPriority w:val="39"/>
@@ -5186,9 +5282,9 @@
       <w:szCs w:val="24"/>
     </w:rPr>
   </w:style>
-  <w:style w:type="character" w:styleId="UnresolvedMention">
+  <w:style w:type="character" w:styleId="Nierozpoznanawzmianka">
     <w:name w:val="Unresolved Mention"/>
-    <w:basedOn w:val="DefaultParagraphFont"/>
+    <w:basedOn w:val="Domylnaczcionkaakapitu"/>
     <w:uiPriority w:val="99"/>
     <w:semiHidden/>
     <w:unhideWhenUsed/>
@@ -5198,13 +5294,13 @@
       <w:shd w:val="clear" w:color="auto" w:fill="E1DFDD"/>
     </w:rPr>
   </w:style>
-  <w:style w:type="paragraph" w:styleId="Bibliography">
+  <w:style w:type="paragraph" w:styleId="Bibliografia">
     <w:name w:val="Bibliography"/>
     <w:uiPriority w:val="37"/>
     <w:unhideWhenUsed/>
     <w:rsid w:val="00844D5D"/>
   </w:style>
-  <w:style w:type="paragraph" w:styleId="NormalWeb">
+  <w:style w:type="paragraph" w:styleId="NormalnyWeb">
     <w:name w:val="Normal (Web)"/>
     <w:uiPriority w:val="99"/>
     <w:semiHidden/>
@@ -5216,9 +5312,9 @@
       <w:szCs w:val="24"/>
     </w:rPr>
   </w:style>
-  <w:style w:type="character" w:styleId="PlaceholderText">
+  <w:style w:type="character" w:styleId="Tekstzastpczy">
     <w:name w:val="Placeholder Text"/>
-    <w:basedOn w:val="DefaultParagraphFont"/>
+    <w:basedOn w:val="Domylnaczcionkaakapitu"/>
     <w:uiPriority w:val="99"/>
     <w:semiHidden/>
     <w:rsid w:val="005D6911"/>
@@ -5226,7 +5322,7 @@
       <w:color w:val="666666"/>
     </w:rPr>
   </w:style>
-  <w:style w:type="paragraph" w:styleId="Index1">
+  <w:style w:type="paragraph" w:styleId="Indeks1">
     <w:name w:val="index 1"/>
     <w:autoRedefine/>
     <w:uiPriority w:val="99"/>
@@ -5238,7 +5334,7 @@
       <w:ind w:left="220" w:hanging="220"/>
     </w:pPr>
   </w:style>
-  <w:style w:type="paragraph" w:styleId="Index2">
+  <w:style w:type="paragraph" w:styleId="Indeks2">
     <w:name w:val="index 2"/>
     <w:autoRedefine/>
     <w:uiPriority w:val="99"/>
@@ -5250,7 +5346,7 @@
       <w:ind w:left="440" w:hanging="220"/>
     </w:pPr>
   </w:style>
-  <w:style w:type="paragraph" w:styleId="NoSpacing">
+  <w:style w:type="paragraph" w:styleId="Bezodstpw">
     <w:name w:val="No Spacing"/>
     <w:uiPriority w:val="1"/>
     <w:qFormat/>
@@ -5259,9 +5355,9 @@
       <w:spacing w:after="0" w:line="240" w:lineRule="auto"/>
     </w:pPr>
   </w:style>
-  <w:style w:type="paragraph" w:styleId="FootnoteText">
+  <w:style w:type="paragraph" w:styleId="Tekstprzypisudolnego">
     <w:name w:val="footnote text"/>
-    <w:link w:val="FootnoteTextChar"/>
+    <w:link w:val="TekstprzypisudolnegoZnak"/>
     <w:uiPriority w:val="99"/>
     <w:semiHidden/>
     <w:unhideWhenUsed/>
@@ -5274,10 +5370,10 @@
       <w:szCs w:val="20"/>
     </w:rPr>
   </w:style>
-  <w:style w:type="character" w:customStyle="1" w:styleId="FootnoteTextChar">
-    <w:name w:val="Footnote Text Char"/>
-    <w:basedOn w:val="DefaultParagraphFont"/>
-    <w:link w:val="FootnoteText"/>
+  <w:style w:type="character" w:customStyle="1" w:styleId="TekstprzypisudolnegoZnak">
+    <w:name w:val="Tekst przypisu dolnego Znak"/>
+    <w:basedOn w:val="Domylnaczcionkaakapitu"/>
+    <w:link w:val="Tekstprzypisudolnego"/>
     <w:uiPriority w:val="99"/>
     <w:semiHidden/>
     <w:rsid w:val="00C1032E"/>
@@ -5286,9 +5382,9 @@
       <w:szCs w:val="20"/>
     </w:rPr>
   </w:style>
-  <w:style w:type="character" w:styleId="FootnoteReference">
+  <w:style w:type="character" w:styleId="Odwoanieprzypisudolnego">
     <w:name w:val="footnote reference"/>
-    <w:basedOn w:val="DefaultParagraphFont"/>
+    <w:basedOn w:val="Domylnaczcionkaakapitu"/>
     <w:uiPriority w:val="99"/>
     <w:semiHidden/>
     <w:unhideWhenUsed/>
@@ -5297,10 +5393,10 @@
       <w:vertAlign w:val="superscript"/>
     </w:rPr>
   </w:style>
-  <w:style w:type="paragraph" w:styleId="Subtitle">
+  <w:style w:type="paragraph" w:styleId="Podtytu">
     <w:name w:val="Subtitle"/>
-    <w:basedOn w:val="Normal"/>
-    <w:next w:val="Normal"/>
+    <w:basedOn w:val="Normalny"/>
+    <w:next w:val="Normalny"/>
     <w:uiPriority w:val="11"/>
     <w:qFormat/>
     <w:rPr>
@@ -5310,7 +5406,7 @@
     </w:rPr>
   </w:style>
   <w:style w:type="table" w:customStyle="1" w:styleId="a">
-    <w:basedOn w:val="TableNormal0"/>
+    <w:basedOn w:val="TableNormal"/>
     <w:pPr>
       <w:spacing w:after="0" w:line="240" w:lineRule="auto"/>
     </w:pPr>
@@ -5326,7 +5422,7 @@
     </w:tblPr>
   </w:style>
   <w:style w:type="table" w:customStyle="1" w:styleId="a0">
-    <w:basedOn w:val="TableNormal0"/>
+    <w:basedOn w:val="TableNormal"/>
     <w:pPr>
       <w:spacing w:after="0" w:line="240" w:lineRule="auto"/>
     </w:pPr>
@@ -5342,7 +5438,7 @@
     </w:tblPr>
   </w:style>
   <w:style w:type="table" w:customStyle="1" w:styleId="a1">
-    <w:basedOn w:val="TableNormal0"/>
+    <w:basedOn w:val="TableNormal"/>
     <w:pPr>
       <w:spacing w:after="0" w:line="240" w:lineRule="auto"/>
     </w:pPr>
@@ -5358,7 +5454,7 @@
     </w:tblPr>
   </w:style>
   <w:style w:type="table" w:customStyle="1" w:styleId="a2">
-    <w:basedOn w:val="TableNormal0"/>
+    <w:basedOn w:val="TableNormal"/>
     <w:pPr>
       <w:spacing w:after="0" w:line="240" w:lineRule="auto"/>
     </w:pPr>
@@ -5374,7 +5470,7 @@
     </w:tblPr>
   </w:style>
   <w:style w:type="table" w:customStyle="1" w:styleId="a3">
-    <w:basedOn w:val="TableNormal0"/>
+    <w:basedOn w:val="TableNormal"/>
     <w:pPr>
       <w:spacing w:after="0" w:line="240" w:lineRule="auto"/>
     </w:pPr>
@@ -5389,7 +5485,7 @@
       </w:tblCellMar>
     </w:tblPr>
   </w:style>
-  <w:style w:type="paragraph" w:styleId="Revision">
+  <w:style w:type="paragraph" w:styleId="Poprawka">
     <w:name w:val="Revision"/>
     <w:hidden/>
     <w:uiPriority w:val="99"/>
@@ -5399,9 +5495,9 @@
       <w:spacing w:after="0" w:line="240" w:lineRule="auto"/>
     </w:pPr>
   </w:style>
-  <w:style w:type="character" w:styleId="CommentReference">
+  <w:style w:type="character" w:styleId="Odwoaniedokomentarza">
     <w:name w:val="annotation reference"/>
-    <w:basedOn w:val="DefaultParagraphFont"/>
+    <w:basedOn w:val="Domylnaczcionkaakapitu"/>
     <w:uiPriority w:val="99"/>
     <w:semiHidden/>
     <w:unhideWhenUsed/>
@@ -5411,10 +5507,10 @@
       <w:szCs w:val="16"/>
     </w:rPr>
   </w:style>
-  <w:style w:type="paragraph" w:styleId="CommentText">
+  <w:style w:type="paragraph" w:styleId="Tekstkomentarza">
     <w:name w:val="annotation text"/>
-    <w:basedOn w:val="Normal"/>
-    <w:link w:val="CommentTextChar"/>
+    <w:basedOn w:val="Normalny"/>
+    <w:link w:val="TekstkomentarzaZnak"/>
     <w:uiPriority w:val="99"/>
     <w:semiHidden/>
     <w:unhideWhenUsed/>
@@ -5427,10 +5523,10 @@
       <w:szCs w:val="20"/>
     </w:rPr>
   </w:style>
-  <w:style w:type="character" w:customStyle="1" w:styleId="CommentTextChar">
-    <w:name w:val="Comment Text Char"/>
-    <w:basedOn w:val="DefaultParagraphFont"/>
-    <w:link w:val="CommentText"/>
+  <w:style w:type="character" w:customStyle="1" w:styleId="TekstkomentarzaZnak">
+    <w:name w:val="Tekst komentarza Znak"/>
+    <w:basedOn w:val="Domylnaczcionkaakapitu"/>
+    <w:link w:val="Tekstkomentarza"/>
     <w:uiPriority w:val="99"/>
     <w:semiHidden/>
     <w:rsid w:val="00314EB0"/>
@@ -5439,11 +5535,11 @@
       <w:szCs w:val="20"/>
     </w:rPr>
   </w:style>
-  <w:style w:type="paragraph" w:styleId="CommentSubject">
+  <w:style w:type="paragraph" w:styleId="Tematkomentarza">
     <w:name w:val="annotation subject"/>
-    <w:basedOn w:val="CommentText"/>
-    <w:next w:val="CommentText"/>
-    <w:link w:val="CommentSubjectChar"/>
+    <w:basedOn w:val="Tekstkomentarza"/>
+    <w:next w:val="Tekstkomentarza"/>
+    <w:link w:val="TematkomentarzaZnak"/>
     <w:uiPriority w:val="99"/>
     <w:semiHidden/>
     <w:unhideWhenUsed/>
@@ -5453,10 +5549,10 @@
       <w:bCs/>
     </w:rPr>
   </w:style>
-  <w:style w:type="character" w:customStyle="1" w:styleId="CommentSubjectChar">
-    <w:name w:val="Comment Subject Char"/>
-    <w:basedOn w:val="CommentTextChar"/>
-    <w:link w:val="CommentSubject"/>
+  <w:style w:type="character" w:customStyle="1" w:styleId="TematkomentarzaZnak">
+    <w:name w:val="Temat komentarza Znak"/>
+    <w:basedOn w:val="TekstkomentarzaZnak"/>
+    <w:link w:val="Tematkomentarza"/>
     <w:uiPriority w:val="99"/>
     <w:semiHidden/>
     <w:rsid w:val="00314EB0"/>

</xml_diff>